<commit_message>
docs(F30): carátula de ENTREGA.docx llena + fix URL repo en README
- ENTREGA.docx Plantilla 1: slogan, fecha, roles, enlaces, resumen
  ejecutivo, cobertura (18/20, 0 FP), uso de IA y checklist
- README.md: corrige URL de clone (andresangulo -> andrulokuras07)

Co-Authored-By: Claude Opus 4.7 <noreply@anthropic.com>
</commit_message>
<xml_diff>
--- a/ENTREGA.docx
+++ b/ENTREGA.docx
@@ -1,11 +1,12 @@
 
 <file path=word/document.xml><?xml version="1.0" encoding="utf-8"?>
-<w:document xmlns:wpc="http://schemas.microsoft.com/office/word/2010/wordprocessingCanvas" xmlns:cx="http://schemas.microsoft.com/office/drawing/2014/chartex" xmlns:cx1="http://schemas.microsoft.com/office/drawing/2015/9/8/chartex" xmlns:cx2="http://schemas.microsoft.com/office/drawing/2015/10/21/chartex" xmlns:cx3="http://schemas.microsoft.com/office/drawing/2016/5/9/chartex" xmlns:cx4="http://schemas.microsoft.com/office/drawing/2016/5/10/chartex" xmlns:cx5="http://schemas.microsoft.com/office/drawing/2016/5/11/chartex" xmlns:mc="http://schemas.openxmlformats.org/markup-compatibility/2006" xmlns:o="urn:schemas-microsoft-com:office:office" xmlns:r="http://schemas.openxmlformats.org/officeDocument/2006/relationships" xmlns:m="http://schemas.openxmlformats.org/officeDocument/2006/math" xmlns:v="urn:schemas-microsoft-com:vml" xmlns:wp14="http://schemas.microsoft.com/office/word/2010/wordprocessingDrawing" xmlns:wp="http://schemas.openxmlformats.org/drawingml/2006/wordprocessingDrawing" xmlns:w10="urn:schemas-microsoft-com:office:word" xmlns:w="http://schemas.openxmlformats.org/wordprocessingml/2006/main" xmlns:w14="http://schemas.microsoft.com/office/word/2010/wordml" xmlns:w15="http://schemas.microsoft.com/office/word/2012/wordml" xmlns:wne="http://schemas.microsoft.com/office/word/2006/wordml" xmlns:w16cid="http://schemas.microsoft.com/office/word/2016/wordml/cid" xmlns:w16se="http://schemas.microsoft.com/office/word/2015/wordml/symex" xmlns:wpg="http://schemas.microsoft.com/office/word/2010/wordprocessingGroup" xmlns:wpi="http://schemas.microsoft.com/office/word/2010/wordprocessingInk" xmlns:wps="http://schemas.microsoft.com/office/word/2010/wordprocessingShape" mc:Ignorable="w14 w15 wp14 w16se w16cid">
-  <!-- Generated by Aspose.Words for .NET 26.4.0 -->
+<w:document xmlns:wpc="http://schemas.microsoft.com/office/word/2010/wordprocessingCanvas" xmlns:cx="http://schemas.microsoft.com/office/drawing/2014/chartex" xmlns:cx1="http://schemas.microsoft.com/office/drawing/2015/9/8/chartex" xmlns:cx2="http://schemas.microsoft.com/office/drawing/2015/10/21/chartex" xmlns:cx3="http://schemas.microsoft.com/office/drawing/2016/5/9/chartex" xmlns:cx4="http://schemas.microsoft.com/office/drawing/2016/5/10/chartex" xmlns:cx5="http://schemas.microsoft.com/office/drawing/2016/5/11/chartex" xmlns:cx6="http://schemas.microsoft.com/office/drawing/2016/5/12/chartex" xmlns:cx7="http://schemas.microsoft.com/office/drawing/2016/5/13/chartex" xmlns:cx8="http://schemas.microsoft.com/office/drawing/2016/5/14/chartex" xmlns:mc="http://schemas.openxmlformats.org/markup-compatibility/2006" xmlns:aink="http://schemas.microsoft.com/office/drawing/2016/ink" xmlns:am3d="http://schemas.microsoft.com/office/drawing/2017/model3d" xmlns:o="urn:schemas-microsoft-com:office:office" xmlns:oel="http://schemas.microsoft.com/office/2019/extlst" xmlns:r="http://schemas.openxmlformats.org/officeDocument/2006/relationships" xmlns:m="http://schemas.openxmlformats.org/officeDocument/2006/math" xmlns:v="urn:schemas-microsoft-com:vml" xmlns:wp14="http://schemas.microsoft.com/office/word/2010/wordprocessingDrawing" xmlns:wp="http://schemas.openxmlformats.org/drawingml/2006/wordprocessingDrawing" xmlns:w10="urn:schemas-microsoft-com:office:word" xmlns:w="http://schemas.openxmlformats.org/wordprocessingml/2006/main" xmlns:w14="http://schemas.microsoft.com/office/word/2010/wordml" xmlns:w15="http://schemas.microsoft.com/office/word/2012/wordml" xmlns:w16cex="http://schemas.microsoft.com/office/word/2018/wordml/cex" xmlns:w16cid="http://schemas.microsoft.com/office/word/2016/wordml/cid" xmlns:w16="http://schemas.microsoft.com/office/word/2018/wordml" xmlns:w16du="http://schemas.microsoft.com/office/word/2023/wordml/word16du" xmlns:w16sdtdh="http://schemas.microsoft.com/office/word/2020/wordml/sdtdatahash" xmlns:w16sdtfl="http://schemas.microsoft.com/office/word/2024/wordml/sdtformatlock" xmlns:w16se="http://schemas.microsoft.com/office/word/2015/wordml/symex" xmlns:wpg="http://schemas.microsoft.com/office/word/2010/wordprocessingGroup" xmlns:wpi="http://schemas.microsoft.com/office/word/2010/wordprocessingInk" xmlns:wne="http://schemas.microsoft.com/office/word/2006/wordml" xmlns:wps="http://schemas.microsoft.com/office/word/2010/wordprocessingShape" mc:Ignorable="w14 w15 w16se w16cid w16 w16cex w16sdtdh w16sdtfl w16du wp14">
   <w:body>
     <w:p>
       <w:pPr>
-        <w:spacing w:before="0"/>
+        <w:rPr>
+          <w:lang w:val="es-MX"/>
+        </w:rPr>
       </w:pPr>
     </w:p>
     <w:p>
@@ -74,16 +75,12 @@
           <w:left w:w="10" w:type="dxa"/>
           <w:right w:w="10" w:type="dxa"/>
         </w:tblCellMar>
-        <w:tblLook w:val="04A0"/>
+        <w:tblLook w:val="04A0" w:firstRow="1" w:lastRow="0" w:firstColumn="1" w:lastColumn="0" w:noHBand="0" w:noVBand="1"/>
       </w:tblPr>
       <w:tblGrid>
         <w:gridCol w:w="9360"/>
       </w:tblGrid>
       <w:tr>
-        <w:tblPrEx>
-          <w:tblW w:w="9360" w:type="dxa"/>
-          <w:tblLook w:val="04A0"/>
-        </w:tblPrEx>
         <w:tc>
           <w:tcPr>
             <w:tcW w:w="9360" w:type="dxa"/>
@@ -158,7 +155,7 @@
     </w:tbl>
     <w:p>
       <w:pPr>
-        <w:pStyle w:val="Heading1"/>
+        <w:pStyle w:val="Ttulo1"/>
       </w:pPr>
       <w:r>
         <w:t>Datos del proyecto</w:t>
@@ -179,17 +176,13 @@
           <w:left w:w="10" w:type="dxa"/>
           <w:right w:w="10" w:type="dxa"/>
         </w:tblCellMar>
-        <w:tblLook w:val="04A0"/>
+        <w:tblLook w:val="04A0" w:firstRow="1" w:lastRow="0" w:firstColumn="1" w:lastColumn="0" w:noHBand="0" w:noVBand="1"/>
       </w:tblPr>
       <w:tblGrid>
         <w:gridCol w:w="3000"/>
         <w:gridCol w:w="6360"/>
       </w:tblGrid>
       <w:tr>
-        <w:tblPrEx>
-          <w:tblW w:w="9360" w:type="dxa"/>
-          <w:tblLook w:val="04A0"/>
-        </w:tblPrEx>
         <w:tc>
           <w:tcPr>
             <w:tcW w:w="3000" w:type="dxa"/>
@@ -246,16 +239,12 @@
                 <w:sz w:val="18"/>
                 <w:szCs w:val="18"/>
               </w:rPr>
-              <w:t>PgGuardian / PgVault / PgPilot</w:t>
+              <w:t>PgPilot</w:t>
             </w:r>
           </w:p>
         </w:tc>
       </w:tr>
       <w:tr>
-        <w:tblPrEx>
-          <w:tblW w:w="9360" w:type="dxa"/>
-          <w:tblLook w:val="04A0"/>
-        </w:tblPrEx>
         <w:tc>
           <w:tcPr>
             <w:tcW w:w="3000" w:type="dxa"/>
@@ -312,16 +301,12 @@
                 <w:sz w:val="18"/>
                 <w:szCs w:val="18"/>
               </w:rPr>
-              <w:t>Inventen un nombre que los identifique</w:t>
+              <w:t>LosQuery</w:t>
             </w:r>
           </w:p>
         </w:tc>
       </w:tr>
       <w:tr>
-        <w:tblPrEx>
-          <w:tblW w:w="9360" w:type="dxa"/>
-          <w:tblLook w:val="04A0"/>
-        </w:tblPrEx>
         <w:tc>
           <w:tcPr>
             <w:tcW w:w="3000" w:type="dxa"/>
@@ -378,16 +363,12 @@
                 <w:sz w:val="18"/>
                 <w:szCs w:val="18"/>
               </w:rPr>
-              <w:t>Una frase corta que defina lo que hacen</w:t>
+              <w:t>Tu copiloto de Postgres</w:t>
             </w:r>
           </w:p>
         </w:tc>
       </w:tr>
       <w:tr>
-        <w:tblPrEx>
-          <w:tblW w:w="9360" w:type="dxa"/>
-          <w:tblLook w:val="04A0"/>
-        </w:tblPrEx>
         <w:tc>
           <w:tcPr>
             <w:tcW w:w="3000" w:type="dxa"/>
@@ -444,7 +425,7 @@
                 <w:sz w:val="18"/>
                 <w:szCs w:val="18"/>
               </w:rPr>
-              <w:t>DD/MM/AAAA</w:t>
+              <w:t>14/05/2026</w:t>
             </w:r>
           </w:p>
         </w:tc>
@@ -452,7 +433,7 @@
     </w:tbl>
     <w:p>
       <w:pPr>
-        <w:pStyle w:val="Heading1"/>
+        <w:pStyle w:val="Ttulo1"/>
       </w:pPr>
       <w:r>
         <w:t>Miembros del equipo</w:t>
@@ -488,19 +469,15 @@
           <w:left w:w="10" w:type="dxa"/>
           <w:right w:w="10" w:type="dxa"/>
         </w:tblCellMar>
-        <w:tblLook w:val="04A0"/>
+        <w:tblLook w:val="04A0" w:firstRow="1" w:lastRow="0" w:firstColumn="1" w:lastColumn="0" w:noHBand="0" w:noVBand="1"/>
       </w:tblPr>
       <w:tblGrid>
-        <w:gridCol w:w="3000"/>
-        <w:gridCol w:w="1800"/>
-        <w:gridCol w:w="2500"/>
-        <w:gridCol w:w="2060"/>
+        <w:gridCol w:w="2087"/>
+        <w:gridCol w:w="1497"/>
+        <w:gridCol w:w="2325"/>
+        <w:gridCol w:w="3451"/>
       </w:tblGrid>
       <w:tr>
-        <w:tblPrEx>
-          <w:tblW w:w="9360" w:type="dxa"/>
-          <w:tblLook w:val="04A0"/>
-        </w:tblPrEx>
         <w:trPr>
           <w:tblHeader/>
         </w:trPr>
@@ -630,10 +607,6 @@
         </w:tc>
       </w:tr>
       <w:tr>
-        <w:tblPrEx>
-          <w:tblW w:w="9360" w:type="dxa"/>
-          <w:tblLook w:val="04A0"/>
-        </w:tblPrEx>
         <w:trPr>
           <w:trHeight w:val="600"/>
         </w:trPr>
@@ -654,7 +627,11 @@
               <w:right w:w="140" w:type="dxa"/>
             </w:tcMar>
           </w:tcPr>
-          <w:p/>
+          <w:p>
+            <w:r>
+              <w:t>Andrés Angulo de Alba</w:t>
+            </w:r>
+          </w:p>
         </w:tc>
         <w:tc>
           <w:tcPr>
@@ -673,7 +650,11 @@
               <w:right w:w="140" w:type="dxa"/>
             </w:tcMar>
           </w:tcPr>
-          <w:p/>
+          <w:p>
+            <w:r>
+              <w:t>00508857</w:t>
+            </w:r>
+          </w:p>
         </w:tc>
         <w:tc>
           <w:tcPr>
@@ -692,7 +673,11 @@
               <w:right w:w="140" w:type="dxa"/>
             </w:tcMar>
           </w:tcPr>
-          <w:p/>
+          <w:p>
+            <w:r>
+              <w:t>Líder técnico — Backend, Conector base y Parser de EXPLAIN</w:t>
+            </w:r>
+          </w:p>
         </w:tc>
         <w:tc>
           <w:tcPr>
@@ -711,14 +696,20 @@
               <w:right w:w="140" w:type="dxa"/>
             </w:tcMar>
           </w:tcPr>
-          <w:p/>
+          <w:p>
+            <w:r>
+              <w:t>andres.angulo@anahu</w:t>
+            </w:r>
+            <w:r>
+              <w:t>a</w:t>
+            </w:r>
+            <w:r>
+              <w:t>c.mx</w:t>
+            </w:r>
+          </w:p>
         </w:tc>
       </w:tr>
       <w:tr>
-        <w:tblPrEx>
-          <w:tblW w:w="9360" w:type="dxa"/>
-          <w:tblLook w:val="04A0"/>
-        </w:tblPrEx>
         <w:trPr>
           <w:trHeight w:val="600"/>
         </w:trPr>
@@ -739,7 +730,11 @@
               <w:right w:w="140" w:type="dxa"/>
             </w:tcMar>
           </w:tcPr>
-          <w:p/>
+          <w:p>
+            <w:r>
+              <w:t>Alexander Riggs Zermeño</w:t>
+            </w:r>
+          </w:p>
         </w:tc>
         <w:tc>
           <w:tcPr>
@@ -758,7 +753,11 @@
               <w:right w:w="140" w:type="dxa"/>
             </w:tcMar>
           </w:tcPr>
-          <w:p/>
+          <w:p>
+            <w:r>
+              <w:t>00508771</w:t>
+            </w:r>
+          </w:p>
         </w:tc>
         <w:tc>
           <w:tcPr>
@@ -777,7 +776,11 @@
               <w:right w:w="140" w:type="dxa"/>
             </w:tcMar>
           </w:tcPr>
-          <w:p/>
+          <w:p>
+            <w:r>
+              <w:t>Sandbox, Conector avanzado (stats/cache/offline) y Documento de negocio</w:t>
+            </w:r>
+          </w:p>
         </w:tc>
         <w:tc>
           <w:tcPr>
@@ -796,14 +799,14 @@
               <w:right w:w="140" w:type="dxa"/>
             </w:tcMar>
           </w:tcPr>
-          <w:p/>
+          <w:p>
+            <w:r>
+              <w:t>alexander.riggs27@anahuac.mx</w:t>
+            </w:r>
+          </w:p>
         </w:tc>
       </w:tr>
       <w:tr>
-        <w:tblPrEx>
-          <w:tblW w:w="9360" w:type="dxa"/>
-          <w:tblLook w:val="04A0"/>
-        </w:tblPrEx>
         <w:trPr>
           <w:trHeight w:val="600"/>
         </w:trPr>
@@ -824,7 +827,11 @@
               <w:right w:w="140" w:type="dxa"/>
             </w:tcMar>
           </w:tcPr>
-          <w:p/>
+          <w:p>
+            <w:r>
+              <w:t>David Ramírez Rodríguez</w:t>
+            </w:r>
+          </w:p>
         </w:tc>
         <w:tc>
           <w:tcPr>
@@ -843,7 +850,11 @@
               <w:right w:w="140" w:type="dxa"/>
             </w:tcMar>
           </w:tcPr>
-          <w:p/>
+          <w:p>
+            <w:r>
+              <w:t>00492597</w:t>
+            </w:r>
+          </w:p>
         </w:tc>
         <w:tc>
           <w:tcPr>
@@ -862,7 +873,11 @@
               <w:right w:w="140" w:type="dxa"/>
             </w:tcMar>
           </w:tcPr>
-          <w:p/>
+          <w:p>
+            <w:r>
+              <w:t>Capa de IA (orquestador, validación cruzada) y detectores avanzados</w:t>
+            </w:r>
+          </w:p>
         </w:tc>
         <w:tc>
           <w:tcPr>
@@ -881,14 +896,14 @@
               <w:right w:w="140" w:type="dxa"/>
             </w:tcMar>
           </w:tcPr>
-          <w:p/>
+          <w:p>
+            <w:r>
+              <w:t>david.ramirez05@anahuac.mx</w:t>
+            </w:r>
+          </w:p>
         </w:tc>
       </w:tr>
       <w:tr>
-        <w:tblPrEx>
-          <w:tblW w:w="9360" w:type="dxa"/>
-          <w:tblLook w:val="04A0"/>
-        </w:tblPrEx>
         <w:trPr>
           <w:trHeight w:val="600"/>
         </w:trPr>
@@ -909,7 +924,12 @@
               <w:right w:w="140" w:type="dxa"/>
             </w:tcMar>
           </w:tcPr>
-          <w:p/>
+          <w:p>
+            <w:r>
+              <w:lastRenderedPageBreak/>
+              <w:t>Diego Nuñéz Chávez</w:t>
+            </w:r>
+          </w:p>
         </w:tc>
         <w:tc>
           <w:tcPr>
@@ -928,7 +948,11 @@
               <w:right w:w="140" w:type="dxa"/>
             </w:tcMar>
           </w:tcPr>
-          <w:p/>
+          <w:p>
+            <w:r>
+              <w:t>00516279</w:t>
+            </w:r>
+          </w:p>
         </w:tc>
         <w:tc>
           <w:tcPr>
@@ -947,7 +971,11 @@
               <w:right w:w="140" w:type="dxa"/>
             </w:tcMar>
           </w:tcPr>
-          <w:p/>
+          <w:p>
+            <w:r>
+              <w:t>Investigación de usuarios (entrevistas) y definición del problema</w:t>
+            </w:r>
+          </w:p>
         </w:tc>
         <w:tc>
           <w:tcPr>
@@ -966,14 +994,14 @@
               <w:right w:w="140" w:type="dxa"/>
             </w:tcMar>
           </w:tcPr>
-          <w:p/>
+          <w:p>
+            <w:r>
+              <w:t>diego.nunez@anahuac.mx</w:t>
+            </w:r>
+          </w:p>
         </w:tc>
       </w:tr>
       <w:tr>
-        <w:tblPrEx>
-          <w:tblW w:w="9360" w:type="dxa"/>
-          <w:tblLook w:val="04A0"/>
-        </w:tblPrEx>
         <w:trPr>
           <w:trHeight w:val="600"/>
         </w:trPr>
@@ -994,7 +1022,11 @@
               <w:right w:w="140" w:type="dxa"/>
             </w:tcMar>
           </w:tcPr>
-          <w:p/>
+          <w:p>
+            <w:r>
+              <w:t>Emilio Antonio Tolosa Soto</w:t>
+            </w:r>
+          </w:p>
         </w:tc>
         <w:tc>
           <w:tcPr>
@@ -1013,7 +1045,11 @@
               <w:right w:w="140" w:type="dxa"/>
             </w:tcMar>
           </w:tcPr>
-          <w:p/>
+          <w:p>
+            <w:r>
+              <w:t>00520630</w:t>
+            </w:r>
+          </w:p>
         </w:tc>
         <w:tc>
           <w:tcPr>
@@ -1032,7 +1068,11 @@
               <w:right w:w="140" w:type="dxa"/>
             </w:tcMar>
           </w:tcPr>
-          <w:p/>
+          <w:p>
+            <w:r>
+              <w:t>Documentación técnica (módulos, catálogo de patterns) y Frontend de validaciones</w:t>
+            </w:r>
+          </w:p>
         </w:tc>
         <w:tc>
           <w:tcPr>
@@ -1051,13 +1091,120 @@
               <w:right w:w="140" w:type="dxa"/>
             </w:tcMar>
           </w:tcPr>
-          <w:p/>
+          <w:p>
+            <w:r>
+              <w:t>emilio_tolosa@anahuac.mx</w:t>
+            </w:r>
+          </w:p>
+        </w:tc>
+      </w:tr>
+      <w:tr>
+        <w:trPr>
+          <w:trHeight w:val="600"/>
+        </w:trPr>
+        <w:tc>
+          <w:tcPr>
+            <w:tcW w:w="3000" w:type="dxa"/>
+            <w:tcBorders>
+              <w:top w:val="single" w:sz="1" w:space="0" w:color="CCCCCC"/>
+              <w:left w:val="single" w:sz="1" w:space="0" w:color="CCCCCC"/>
+              <w:bottom w:val="single" w:sz="1" w:space="0" w:color="CCCCCC"/>
+              <w:right w:val="single" w:sz="1" w:space="0" w:color="CCCCCC"/>
+            </w:tcBorders>
+            <w:shd w:val="clear" w:color="auto" w:fill="F2F2F2"/>
+            <w:tcMar>
+              <w:top w:w="100" w:type="dxa"/>
+              <w:left w:w="140" w:type="dxa"/>
+              <w:bottom w:w="100" w:type="dxa"/>
+              <w:right w:w="140" w:type="dxa"/>
+            </w:tcMar>
+          </w:tcPr>
+          <w:p>
+            <w:r>
+              <w:t>Regina Valenzuela Davila</w:t>
+            </w:r>
+          </w:p>
+        </w:tc>
+        <w:tc>
+          <w:tcPr>
+            <w:tcW w:w="1800" w:type="dxa"/>
+            <w:tcBorders>
+              <w:top w:val="single" w:sz="1" w:space="0" w:color="CCCCCC"/>
+              <w:left w:val="single" w:sz="1" w:space="0" w:color="CCCCCC"/>
+              <w:bottom w:val="single" w:sz="1" w:space="0" w:color="CCCCCC"/>
+              <w:right w:val="single" w:sz="1" w:space="0" w:color="CCCCCC"/>
+            </w:tcBorders>
+            <w:shd w:val="clear" w:color="auto" w:fill="F2F2F2"/>
+            <w:tcMar>
+              <w:top w:w="100" w:type="dxa"/>
+              <w:left w:w="140" w:type="dxa"/>
+              <w:bottom w:w="100" w:type="dxa"/>
+              <w:right w:w="140" w:type="dxa"/>
+            </w:tcMar>
+          </w:tcPr>
+          <w:p>
+            <w:r>
+              <w:t>00508321</w:t>
+            </w:r>
+          </w:p>
+        </w:tc>
+        <w:tc>
+          <w:tcPr>
+            <w:tcW w:w="2500" w:type="dxa"/>
+            <w:tcBorders>
+              <w:top w:val="single" w:sz="1" w:space="0" w:color="CCCCCC"/>
+              <w:left w:val="single" w:sz="1" w:space="0" w:color="CCCCCC"/>
+              <w:bottom w:val="single" w:sz="1" w:space="0" w:color="CCCCCC"/>
+              <w:right w:val="single" w:sz="1" w:space="0" w:color="CCCCCC"/>
+            </w:tcBorders>
+            <w:shd w:val="clear" w:color="auto" w:fill="F2F2F2"/>
+            <w:tcMar>
+              <w:top w:w="100" w:type="dxa"/>
+              <w:left w:w="140" w:type="dxa"/>
+              <w:bottom w:w="100" w:type="dxa"/>
+              <w:right w:w="140" w:type="dxa"/>
+            </w:tcMar>
+          </w:tcPr>
+          <w:p>
+            <w:r>
+              <w:t>Motor de detección y sanitización de literales (capa IA)</w:t>
+            </w:r>
+          </w:p>
+        </w:tc>
+        <w:tc>
+          <w:tcPr>
+            <w:tcW w:w="2060" w:type="dxa"/>
+            <w:tcBorders>
+              <w:top w:val="single" w:sz="1" w:space="0" w:color="CCCCCC"/>
+              <w:left w:val="single" w:sz="1" w:space="0" w:color="CCCCCC"/>
+              <w:bottom w:val="single" w:sz="1" w:space="0" w:color="CCCCCC"/>
+              <w:right w:val="single" w:sz="1" w:space="0" w:color="CCCCCC"/>
+            </w:tcBorders>
+            <w:shd w:val="clear" w:color="auto" w:fill="F2F2F2"/>
+            <w:tcMar>
+              <w:top w:w="100" w:type="dxa"/>
+              <w:left w:w="140" w:type="dxa"/>
+              <w:bottom w:w="100" w:type="dxa"/>
+              <w:right w:w="140" w:type="dxa"/>
+            </w:tcMar>
+          </w:tcPr>
+          <w:p>
+            <w:r>
+              <w:t>rvalenzuela@anahu</w:t>
+            </w:r>
+            <w:r>
+              <w:t>a</w:t>
+            </w:r>
+            <w:r>
+              <w:t>c.mx</w:t>
+            </w:r>
+          </w:p>
         </w:tc>
       </w:tr>
     </w:tbl>
     <w:p>
       <w:pPr>
-        <w:pStyle w:val="Heading1"/>
+        <w:pStyle w:val="Ttulo1"/>
       </w:pPr>
       <w:r>
         <w:t>Enlaces a entregables</w:t>
@@ -1093,17 +1240,13 @@
           <w:left w:w="10" w:type="dxa"/>
           <w:right w:w="10" w:type="dxa"/>
         </w:tblCellMar>
-        <w:tblLook w:val="04A0"/>
+        <w:tblLook w:val="04A0" w:firstRow="1" w:lastRow="0" w:firstColumn="1" w:lastColumn="0" w:noHBand="0" w:noVBand="1"/>
       </w:tblPr>
       <w:tblGrid>
         <w:gridCol w:w="3000"/>
         <w:gridCol w:w="6360"/>
       </w:tblGrid>
       <w:tr>
-        <w:tblPrEx>
-          <w:tblW w:w="9360" w:type="dxa"/>
-          <w:tblLook w:val="04A0"/>
-        </w:tblPrEx>
         <w:tc>
           <w:tcPr>
             <w:tcW w:w="3000" w:type="dxa"/>
@@ -1160,16 +1303,12 @@
                 <w:sz w:val="18"/>
                 <w:szCs w:val="18"/>
               </w:rPr>
-              <w:t>https://github.com/usuario/repo o Bitbucket</w:t>
+              <w:t>https://github.com/andrulokuras07/pgpilot</w:t>
             </w:r>
           </w:p>
         </w:tc>
       </w:tr>
       <w:tr>
-        <w:tblPrEx>
-          <w:tblW w:w="9360" w:type="dxa"/>
-          <w:tblLook w:val="04A0"/>
-        </w:tblPrEx>
         <w:tc>
           <w:tcPr>
             <w:tcW w:w="3000" w:type="dxa"/>
@@ -1226,16 +1365,12 @@
                 <w:sz w:val="18"/>
                 <w:szCs w:val="18"/>
               </w:rPr>
-              <w:t>Link a YouTube, Drive, Loom, etc.</w:t>
+              <w:t>Pendiente — se grabará antes del Demo Day</w:t>
             </w:r>
           </w:p>
         </w:tc>
       </w:tr>
       <w:tr>
-        <w:tblPrEx>
-          <w:tblW w:w="9360" w:type="dxa"/>
-          <w:tblLook w:val="04A0"/>
-        </w:tblPrEx>
         <w:tc>
           <w:tcPr>
             <w:tcW w:w="3000" w:type="dxa"/>
@@ -1292,16 +1427,12 @@
                 <w:sz w:val="18"/>
                 <w:szCs w:val="18"/>
               </w:rPr>
-              <w:t>Solo si tomaron el bonus</w:t>
+              <w:t>No aplica</w:t>
             </w:r>
           </w:p>
         </w:tc>
       </w:tr>
       <w:tr>
-        <w:tblPrEx>
-          <w:tblW w:w="9360" w:type="dxa"/>
-          <w:tblLook w:val="04A0"/>
-        </w:tblPrEx>
         <w:tc>
           <w:tcPr>
             <w:tcW w:w="3000" w:type="dxa"/>
@@ -1358,7 +1489,7 @@
                 <w:sz w:val="18"/>
                 <w:szCs w:val="18"/>
               </w:rPr>
-              <w:t>URL pública si lo desplegaron en cloud</w:t>
+              <w:t>No aplica (despliegue local con docker-compose)</w:t>
             </w:r>
           </w:p>
         </w:tc>
@@ -1366,7 +1497,7 @@
     </w:tbl>
     <w:p>
       <w:pPr>
-        <w:pStyle w:val="Heading1"/>
+        <w:pStyle w:val="Ttulo1"/>
       </w:pPr>
       <w:r>
         <w:t>Resumen ejecutivo</w:t>
@@ -1402,16 +1533,12 @@
           <w:left w:w="10" w:type="dxa"/>
           <w:right w:w="10" w:type="dxa"/>
         </w:tblCellMar>
-        <w:tblLook w:val="04A0"/>
+        <w:tblLook w:val="04A0" w:firstRow="1" w:lastRow="0" w:firstColumn="1" w:lastColumn="0" w:noHBand="0" w:noVBand="1"/>
       </w:tblPr>
       <w:tblGrid>
         <w:gridCol w:w="9360"/>
       </w:tblGrid>
       <w:tr>
-        <w:tblPrEx>
-          <w:tblW w:w="9360" w:type="dxa"/>
-          <w:tblLook w:val="04A0"/>
-        </w:tblPrEx>
         <w:trPr>
           <w:trHeight w:val="1800"/>
         </w:trPr>
@@ -1441,7 +1568,43 @@
                 <w:sz w:val="20"/>
                 <w:szCs w:val="20"/>
               </w:rPr>
-              <w:t>Escriban aquí su resumen ejecutivo (200-300 palabras). Debe cubrir: problema, usuario objetivo, solución propuesta, diferenciador frente a competidores. Sin tecnicismos: alguien sin background técnico debería entender de qué se trata.</w:t>
+              <w:t>PgPilot es un analizador inteligente de queries Postgres que detecta anti-patterns, recomienda índices y sugiere reescrituras combinando un motor determinístico con una capa de IA con guardrails. Está dirigido a equipos de backend de 5 a 50 desarrolladores que tienen Postgres en producción pero no cuentan con un DBA dedicado.</w:t>
+            </w:r>
+          </w:p>
+          <w:p>
+            <w:r>
+              <w:rPr>
+                <w:i/>
+                <w:iCs/>
+                <w:color w:val="A0826D"/>
+                <w:sz w:val="20"/>
+                <w:szCs w:val="20"/>
+              </w:rPr>
+              <w:t>El problema: hoy, optimizar una query lenta significa abrir psql, leer EXPLAIN crudo, hipotetizar, probar índices a ciegas, esperar y repetir. Los desarrolladores consultados en nuestras entrevistas reportan entre 4 y 10 horas semanales perdidas en este ciclo, además de incidentes recurrentes de degradación de servicio que no se previeron a tiempo.</w:t>
+            </w:r>
+          </w:p>
+          <w:p>
+            <w:r>
+              <w:rPr>
+                <w:i/>
+                <w:iCs/>
+                <w:color w:val="A0826D"/>
+                <w:sz w:val="20"/>
+                <w:szCs w:val="20"/>
+              </w:rPr>
+              <w:t>La solución: PgPilot recibe una query, conecta a la base en modo read-only forzado, ejecuta EXPLAIN, parsea el plan estructuralmente y aplica un catálogo de detectores deterministas (Seq Scan en tabla grande, sort en disco, LIKE con wildcard, IN/NOT IN frágiles, HAVING que debería ser WHERE, entre otros). Cada recomendación se valida en un sandbox Postgres efímero antes de mostrarse, garantizando que el planner realmente la usaría. Sobre ese resultado, una capa de IA (Claude) explica el problema en lenguaje claro; el motor manda y la IA explica, nunca al revés.</w:t>
+            </w:r>
+          </w:p>
+          <w:p>
+            <w:r>
+              <w:rPr>
+                <w:i/>
+                <w:iCs/>
+                <w:color w:val="A0826D"/>
+                <w:sz w:val="20"/>
+                <w:szCs w:val="20"/>
+              </w:rPr>
+              <w:t>Diferenciador frente a pganalyze, EverSQL y pgMustard: foco LATAM, sanitización fuerte de literales antes de tocar el LLM (privacidad por defecto), modo offline para empresas con datos sensibles y validación con sandbox para eliminar alucinaciones. El producto funciona incluso con la IA apagada gracias a plantillas determinísticas, demostrando que el valor central no depende del LLM.</w:t>
             </w:r>
           </w:p>
         </w:tc>
@@ -1449,9 +1612,10 @@
     </w:tbl>
     <w:p>
       <w:pPr>
-        <w:pStyle w:val="Heading1"/>
-      </w:pPr>
-      <w:r>
+        <w:pStyle w:val="Ttulo1"/>
+      </w:pPr>
+      <w:r>
+        <w:lastRenderedPageBreak/>
         <w:t>Cobertura sobre BD demo oficial</w:t>
       </w:r>
     </w:p>
@@ -1485,17 +1649,13 @@
           <w:left w:w="10" w:type="dxa"/>
           <w:right w:w="10" w:type="dxa"/>
         </w:tblCellMar>
-        <w:tblLook w:val="04A0"/>
+        <w:tblLook w:val="04A0" w:firstRow="1" w:lastRow="0" w:firstColumn="1" w:lastColumn="0" w:noHBand="0" w:noVBand="1"/>
       </w:tblPr>
       <w:tblGrid>
         <w:gridCol w:w="3000"/>
         <w:gridCol w:w="6360"/>
       </w:tblGrid>
       <w:tr>
-        <w:tblPrEx>
-          <w:tblW w:w="9360" w:type="dxa"/>
-          <w:tblLook w:val="04A0"/>
-        </w:tblPrEx>
         <w:tc>
           <w:tcPr>
             <w:tcW w:w="3000" w:type="dxa"/>
@@ -1552,16 +1712,12 @@
                 <w:sz w:val="18"/>
                 <w:szCs w:val="18"/>
               </w:rPr>
-              <w:t>TiendaDB / FintechDB / AppDB</w:t>
+              <w:t>AppDB v1 (oficial del curso)</w:t>
             </w:r>
           </w:p>
         </w:tc>
       </w:tr>
       <w:tr>
-        <w:tblPrEx>
-          <w:tblW w:w="9360" w:type="dxa"/>
-          <w:tblLook w:val="04A0"/>
-        </w:tblPrEx>
         <w:tc>
           <w:tcPr>
             <w:tcW w:w="3000" w:type="dxa"/>
@@ -1618,16 +1774,12 @@
                 <w:sz w:val="18"/>
                 <w:szCs w:val="18"/>
               </w:rPr>
-              <w:t>Según la lista maestra del profesor</w:t>
+              <w:t>20</w:t>
             </w:r>
           </w:p>
         </w:tc>
       </w:tr>
       <w:tr>
-        <w:tblPrEx>
-          <w:tblW w:w="9360" w:type="dxa"/>
-          <w:tblLook w:val="04A0"/>
-        </w:tblPrEx>
         <w:tc>
           <w:tcPr>
             <w:tcW w:w="3000" w:type="dxa"/>
@@ -1684,16 +1836,12 @@
                 <w:sz w:val="18"/>
                 <w:szCs w:val="18"/>
               </w:rPr>
-              <w:t>Cantidad</w:t>
+              <w:t>18</w:t>
             </w:r>
           </w:p>
         </w:tc>
       </w:tr>
       <w:tr>
-        <w:tblPrEx>
-          <w:tblW w:w="9360" w:type="dxa"/>
-          <w:tblLook w:val="04A0"/>
-        </w:tblPrEx>
         <w:tc>
           <w:tcPr>
             <w:tcW w:w="3000" w:type="dxa"/>
@@ -1750,16 +1898,12 @@
                 <w:sz w:val="18"/>
                 <w:szCs w:val="18"/>
               </w:rPr>
-              <w:t>Cantidad</w:t>
+              <w:t>0 (verificado sobre 10 queries sanas)</w:t>
             </w:r>
           </w:p>
         </w:tc>
       </w:tr>
       <w:tr>
-        <w:tblPrEx>
-          <w:tblW w:w="9360" w:type="dxa"/>
-          <w:tblLook w:val="04A0"/>
-        </w:tblPrEx>
         <w:tc>
           <w:tcPr>
             <w:tcW w:w="3000" w:type="dxa"/>
@@ -1816,7 +1960,7 @@
                 <w:sz w:val="18"/>
                 <w:szCs w:val="18"/>
               </w:rPr>
-              <w:t>Ej: 18/22 = 81 %</w:t>
+              <w:t>18 / 20 = 90 %</w:t>
             </w:r>
           </w:p>
         </w:tc>
@@ -1824,7 +1968,7 @@
     </w:tbl>
     <w:p>
       <w:pPr>
-        <w:pStyle w:val="Heading1"/>
+        <w:pStyle w:val="Ttulo1"/>
       </w:pPr>
       <w:r>
         <w:t>Declaración de uso de IA</w:t>
@@ -1845,16 +1989,12 @@
           <w:left w:w="10" w:type="dxa"/>
           <w:right w:w="10" w:type="dxa"/>
         </w:tblCellMar>
-        <w:tblLook w:val="04A0"/>
+        <w:tblLook w:val="04A0" w:firstRow="1" w:lastRow="0" w:firstColumn="1" w:lastColumn="0" w:noHBand="0" w:noVBand="1"/>
       </w:tblPr>
       <w:tblGrid>
         <w:gridCol w:w="9360"/>
       </w:tblGrid>
       <w:tr>
-        <w:tblPrEx>
-          <w:tblW w:w="9360" w:type="dxa"/>
-          <w:tblLook w:val="04A0"/>
-        </w:tblPrEx>
         <w:tc>
           <w:tcPr>
             <w:tcW w:w="9360" w:type="dxa"/>
@@ -1955,7 +2095,7 @@
     </w:p>
     <w:p>
       <w:pPr>
-        <w:pStyle w:val="ListParagraph"/>
+        <w:pStyle w:val="Prrafodelista"/>
         <w:numPr>
           <w:ilvl w:val="0"/>
           <w:numId w:val="2"/>
@@ -1971,7 +2111,7 @@
     </w:p>
     <w:p>
       <w:pPr>
-        <w:pStyle w:val="ListParagraph"/>
+        <w:pStyle w:val="Prrafodelista"/>
         <w:numPr>
           <w:ilvl w:val="0"/>
           <w:numId w:val="2"/>
@@ -1982,12 +2122,12 @@
         <w:rPr>
           <w:color w:val="231F20"/>
         </w:rPr>
-        <w:t>[ ] Claude (Anthropic)</w:t>
-      </w:r>
-    </w:p>
-    <w:p>
-      <w:pPr>
-        <w:pStyle w:val="ListParagraph"/>
+        <w:t>[x] Claude (Anthropic)</w:t>
+      </w:r>
+    </w:p>
+    <w:p>
+      <w:pPr>
+        <w:pStyle w:val="Prrafodelista"/>
         <w:numPr>
           <w:ilvl w:val="0"/>
           <w:numId w:val="2"/>
@@ -2003,7 +2143,7 @@
     </w:p>
     <w:p>
       <w:pPr>
-        <w:pStyle w:val="ListParagraph"/>
+        <w:pStyle w:val="Prrafodelista"/>
         <w:numPr>
           <w:ilvl w:val="0"/>
           <w:numId w:val="2"/>
@@ -2019,7 +2159,7 @@
     </w:p>
     <w:p>
       <w:pPr>
-        <w:pStyle w:val="ListParagraph"/>
+        <w:pStyle w:val="Prrafodelista"/>
         <w:numPr>
           <w:ilvl w:val="0"/>
           <w:numId w:val="2"/>
@@ -2035,7 +2175,7 @@
     </w:p>
     <w:p>
       <w:pPr>
-        <w:pStyle w:val="ListParagraph"/>
+        <w:pStyle w:val="Prrafodelista"/>
         <w:numPr>
           <w:ilvl w:val="0"/>
           <w:numId w:val="2"/>
@@ -2062,7 +2202,7 @@
     </w:p>
     <w:p>
       <w:pPr>
-        <w:pStyle w:val="ListParagraph"/>
+        <w:pStyle w:val="Prrafodelista"/>
         <w:numPr>
           <w:ilvl w:val="0"/>
           <w:numId w:val="2"/>
@@ -2073,12 +2213,12 @@
         <w:rPr>
           <w:color w:val="231F20"/>
         </w:rPr>
-        <w:t>[ ] Generación de código (boilerplate, funciones, scripts)</w:t>
-      </w:r>
-    </w:p>
-    <w:p>
-      <w:pPr>
-        <w:pStyle w:val="ListParagraph"/>
+        <w:t>[x] Generación de código (boilerplate, funciones, scripts)</w:t>
+      </w:r>
+    </w:p>
+    <w:p>
+      <w:pPr>
+        <w:pStyle w:val="Prrafodelista"/>
         <w:numPr>
           <w:ilvl w:val="0"/>
           <w:numId w:val="2"/>
@@ -2089,12 +2229,12 @@
         <w:rPr>
           <w:color w:val="231F20"/>
         </w:rPr>
-        <w:t>[ ] Debugging y resolución de errores</w:t>
-      </w:r>
-    </w:p>
-    <w:p>
-      <w:pPr>
-        <w:pStyle w:val="ListParagraph"/>
+        <w:t>[x] Debugging y resolución de errores</w:t>
+      </w:r>
+    </w:p>
+    <w:p>
+      <w:pPr>
+        <w:pStyle w:val="Prrafodelista"/>
         <w:numPr>
           <w:ilvl w:val="0"/>
           <w:numId w:val="2"/>
@@ -2110,7 +2250,7 @@
     </w:p>
     <w:p>
       <w:pPr>
-        <w:pStyle w:val="ListParagraph"/>
+        <w:pStyle w:val="Prrafodelista"/>
         <w:numPr>
           <w:ilvl w:val="0"/>
           <w:numId w:val="2"/>
@@ -2121,12 +2261,12 @@
         <w:rPr>
           <w:color w:val="231F20"/>
         </w:rPr>
-        <w:t>[ ] Documentación técnica</w:t>
-      </w:r>
-    </w:p>
-    <w:p>
-      <w:pPr>
-        <w:pStyle w:val="ListParagraph"/>
+        <w:t>[x] Documentación técnica</w:t>
+      </w:r>
+    </w:p>
+    <w:p>
+      <w:pPr>
+        <w:pStyle w:val="Prrafodelista"/>
         <w:numPr>
           <w:ilvl w:val="0"/>
           <w:numId w:val="2"/>
@@ -2137,12 +2277,12 @@
         <w:rPr>
           <w:color w:val="231F20"/>
         </w:rPr>
-        <w:t>[ ] Documento de negocio</w:t>
-      </w:r>
-    </w:p>
-    <w:p>
-      <w:pPr>
-        <w:pStyle w:val="ListParagraph"/>
+        <w:t>[x] Documento de negocio</w:t>
+      </w:r>
+    </w:p>
+    <w:p>
+      <w:pPr>
+        <w:pStyle w:val="Prrafodelista"/>
         <w:numPr>
           <w:ilvl w:val="0"/>
           <w:numId w:val="2"/>
@@ -2158,7 +2298,7 @@
     </w:p>
     <w:p>
       <w:pPr>
-        <w:pStyle w:val="ListParagraph"/>
+        <w:pStyle w:val="Prrafodelista"/>
         <w:numPr>
           <w:ilvl w:val="0"/>
           <w:numId w:val="2"/>
@@ -2169,12 +2309,12 @@
         <w:rPr>
           <w:color w:val="231F20"/>
         </w:rPr>
-        <w:t>[ ] Generación de datos sintéticos para pruebas</w:t>
-      </w:r>
-    </w:p>
-    <w:p>
-      <w:pPr>
-        <w:pStyle w:val="ListParagraph"/>
+        <w:t>[x] Generación de datos sintéticos para pruebas</w:t>
+      </w:r>
+    </w:p>
+    <w:p>
+      <w:pPr>
+        <w:pStyle w:val="Prrafodelista"/>
         <w:numPr>
           <w:ilvl w:val="0"/>
           <w:numId w:val="2"/>
@@ -2185,12 +2325,12 @@
         <w:rPr>
           <w:color w:val="231F20"/>
         </w:rPr>
-        <w:t>[ ] Como parte del producto en runtime (ej: PgPilot)</w:t>
-      </w:r>
-    </w:p>
-    <w:p>
-      <w:pPr>
-        <w:pStyle w:val="ListParagraph"/>
+        <w:t>[x] Como parte del producto en runtime (ej: PgPilot)</w:t>
+      </w:r>
+    </w:p>
+    <w:p>
+      <w:pPr>
+        <w:pStyle w:val="Prrafodelista"/>
         <w:numPr>
           <w:ilvl w:val="0"/>
           <w:numId w:val="2"/>
@@ -2230,16 +2370,12 @@
           <w:left w:w="10" w:type="dxa"/>
           <w:right w:w="10" w:type="dxa"/>
         </w:tblCellMar>
-        <w:tblLook w:val="04A0"/>
+        <w:tblLook w:val="04A0" w:firstRow="1" w:lastRow="0" w:firstColumn="1" w:lastColumn="0" w:noHBand="0" w:noVBand="1"/>
       </w:tblPr>
       <w:tblGrid>
         <w:gridCol w:w="9360"/>
       </w:tblGrid>
       <w:tr>
-        <w:tblPrEx>
-          <w:tblW w:w="9360" w:type="dxa"/>
-          <w:tblLook w:val="04A0"/>
-        </w:tblPrEx>
         <w:trPr>
           <w:trHeight w:val="1500"/>
         </w:trPr>
@@ -2269,7 +2405,20 @@
                 <w:sz w:val="20"/>
                 <w:szCs w:val="20"/>
               </w:rPr>
-              <w:t>Escriban con honestidad cómo usaron IA. Ejemplo: "Usamos Claude para generar el boilerplate inicial del parser de EXPLAIN, pero la lógica de detección de anti-patterns la programamos manualmente. Para el documento de negocio usamos GPT como apoyo en la redacción, pero el análisis competitivo y las entrevistas son nuestras". 100-200 palabras.</w:t>
+              <w:lastRenderedPageBreak/>
+              <w:t>Usamos Claude (Anthropic) en dos planos. En desarrollo, Claude Code asistió al equipo generando boilerplate (scaffold de Vite/React, parser inicial de EXPLAIN, fixtures de tests, scripts de llenado de plantillas .docx), apoyando el debugging y redactando la documentación técnica de cada módulo (los CLAUDE.md de /conector, /motor, /ia, /sandbox, /backend, /frontend) así como secciones del documento de negocio (F15). Todas las decisiones de arquitectura, los criterios de los detectores, las reglas operativas (RULES.md) y la lógica del motor determinístico fueron diseñadas y revisadas por el equipo; el código generado fue leído, ajustado y testeado antes de mergearse.</w:t>
+            </w:r>
+          </w:p>
+          <w:p>
+            <w:r>
+              <w:rPr>
+                <w:i/>
+                <w:iCs/>
+                <w:color w:val="A0826D"/>
+                <w:sz w:val="20"/>
+                <w:szCs w:val="20"/>
+              </w:rPr>
+              <w:t>En runtime, Claude es parte del producto: recibe el plan parseado, la detección y la recomendación del motor, y produce una explicación pedagógica del problema y un rewrite opcional. La capa de IA está sujeta a guardrails: sanitización de literales antes de cualquier llamada, validación cruzada de las propuestas contra el schema y el sandbox, y modo 'LLM apagado' con plantillas determinísticas como fallback.</w:t>
             </w:r>
           </w:p>
         </w:tc>
@@ -2277,7 +2426,7 @@
     </w:tbl>
     <w:p>
       <w:pPr>
-        <w:pStyle w:val="Heading1"/>
+        <w:pStyle w:val="Ttulo1"/>
       </w:pPr>
       <w:r>
         <w:t>Checklist de entregables</w:t>
@@ -2300,7 +2449,7 @@
     </w:p>
     <w:p>
       <w:pPr>
-        <w:pStyle w:val="ListParagraph"/>
+        <w:pStyle w:val="Prrafodelista"/>
         <w:numPr>
           <w:ilvl w:val="0"/>
           <w:numId w:val="2"/>
@@ -2311,12 +2460,12 @@
         <w:rPr>
           <w:color w:val="231F20"/>
         </w:rPr>
-        <w:t>[ ] README claro con instrucciones de instalación y uso</w:t>
-      </w:r>
-    </w:p>
-    <w:p>
-      <w:pPr>
-        <w:pStyle w:val="ListParagraph"/>
+        <w:t>[x] README claro con instrucciones de instalación y uso</w:t>
+      </w:r>
+    </w:p>
+    <w:p>
+      <w:pPr>
+        <w:pStyle w:val="Prrafodelista"/>
         <w:numPr>
           <w:ilvl w:val="0"/>
           <w:numId w:val="2"/>
@@ -2327,12 +2476,12 @@
         <w:rPr>
           <w:color w:val="231F20"/>
         </w:rPr>
-        <w:t>[ ] docker-compose.yml funcional probado en máquina limpia</w:t>
-      </w:r>
-    </w:p>
-    <w:p>
-      <w:pPr>
-        <w:pStyle w:val="ListParagraph"/>
+        <w:t>[x] docker-compose.yml funcional probado en máquina limpia</w:t>
+      </w:r>
+    </w:p>
+    <w:p>
+      <w:pPr>
+        <w:pStyle w:val="Prrafodelista"/>
         <w:numPr>
           <w:ilvl w:val="0"/>
           <w:numId w:val="2"/>
@@ -2343,12 +2492,12 @@
         <w:rPr>
           <w:color w:val="231F20"/>
         </w:rPr>
-        <w:t>[ ] Documento de arquitectura (esta plantilla, sección 2)</w:t>
-      </w:r>
-    </w:p>
-    <w:p>
-      <w:pPr>
-        <w:pStyle w:val="ListParagraph"/>
+        <w:t>[x] Documento de arquitectura (esta plantilla, sección 2)</w:t>
+      </w:r>
+    </w:p>
+    <w:p>
+      <w:pPr>
+        <w:pStyle w:val="Prrafodelista"/>
         <w:numPr>
           <w:ilvl w:val="0"/>
           <w:numId w:val="2"/>
@@ -2359,12 +2508,12 @@
         <w:rPr>
           <w:color w:val="231F20"/>
         </w:rPr>
-        <w:t>[ ] Documento de negocio (esta plantilla, sección 3)</w:t>
-      </w:r>
-    </w:p>
-    <w:p>
-      <w:pPr>
-        <w:pStyle w:val="ListParagraph"/>
+        <w:t>[x] Documento de negocio (esta plantilla, sección 3)</w:t>
+      </w:r>
+    </w:p>
+    <w:p>
+      <w:pPr>
+        <w:pStyle w:val="Prrafodelista"/>
         <w:numPr>
           <w:ilvl w:val="0"/>
           <w:numId w:val="2"/>
@@ -2375,12 +2524,12 @@
         <w:rPr>
           <w:color w:val="231F20"/>
         </w:rPr>
-        <w:t>[ ] Catálogo de reglas / detectores / anti-patterns implementados</w:t>
-      </w:r>
-    </w:p>
-    <w:p>
-      <w:pPr>
-        <w:pStyle w:val="ListParagraph"/>
+        <w:t>[x] Catálogo de reglas / detectores / anti-patterns implementados</w:t>
+      </w:r>
+    </w:p>
+    <w:p>
+      <w:pPr>
+        <w:pStyle w:val="Prrafodelista"/>
         <w:numPr>
           <w:ilvl w:val="0"/>
           <w:numId w:val="2"/>
@@ -2396,7 +2545,7 @@
     </w:p>
     <w:p>
       <w:pPr>
-        <w:pStyle w:val="ListParagraph"/>
+        <w:pStyle w:val="Prrafodelista"/>
         <w:numPr>
           <w:ilvl w:val="0"/>
           <w:numId w:val="2"/>
@@ -2407,12 +2556,24 @@
         <w:rPr>
           <w:color w:val="231F20"/>
         </w:rPr>
-        <w:t>[ ] Historial de Git con contribuciones de los 5 miembros</w:t>
-      </w:r>
-    </w:p>
-    <w:p>
-      <w:pPr>
-        <w:pStyle w:val="ListParagraph"/>
+        <w:t xml:space="preserve">[x] Historial de Git con contribuciones de los </w:t>
+      </w:r>
+      <w:r>
+        <w:rPr>
+          <w:color w:val="231F20"/>
+        </w:rPr>
+        <w:t>6</w:t>
+      </w:r>
+      <w:r>
+        <w:rPr>
+          <w:color w:val="231F20"/>
+        </w:rPr>
+        <w:t xml:space="preserve"> miembros</w:t>
+      </w:r>
+    </w:p>
+    <w:p>
+      <w:pPr>
+        <w:pStyle w:val="Prrafodelista"/>
         <w:numPr>
           <w:ilvl w:val="0"/>
           <w:numId w:val="2"/>
@@ -2423,7 +2584,7 @@
         <w:rPr>
           <w:color w:val="231F20"/>
         </w:rPr>
-        <w:t>[ ] Esta carátula completa con todos los datos</w:t>
+        <w:t>[x] Esta carátula completa con todos los datos</w:t>
       </w:r>
     </w:p>
     <w:p>
@@ -2446,16 +2607,12 @@
           <w:left w:w="10" w:type="dxa"/>
           <w:right w:w="10" w:type="dxa"/>
         </w:tblCellMar>
-        <w:tblLook w:val="04A0"/>
+        <w:tblLook w:val="04A0" w:firstRow="1" w:lastRow="0" w:firstColumn="1" w:lastColumn="0" w:noHBand="0" w:noVBand="1"/>
       </w:tblPr>
       <w:tblGrid>
         <w:gridCol w:w="9360"/>
       </w:tblGrid>
       <w:tr>
-        <w:tblPrEx>
-          <w:tblW w:w="9360" w:type="dxa"/>
-          <w:tblLook w:val="04A0"/>
-        </w:tblPrEx>
         <w:tc>
           <w:tcPr>
             <w:tcW w:w="9360" w:type="dxa"/>
@@ -2556,21 +2713,39 @@
     </w:tbl>
     <w:p/>
     <w:sectPr>
-      <w:headerReference w:type="default" r:id="rId4"/>
-      <w:footerReference w:type="default" r:id="rId5"/>
+      <w:headerReference w:type="default" r:id="rId7"/>
+      <w:footerReference w:type="default" r:id="rId8"/>
       <w:pgSz w:w="12240" w:h="15840"/>
       <w:pgMar w:top="1700" w:right="1440" w:bottom="1100" w:left="1440" w:header="708" w:footer="708" w:gutter="0"/>
       <w:pgNumType w:start="3"/>
       <w:cols w:space="720"/>
-      <w:titlePg w:val="0"/>
       <w:docGrid w:linePitch="360"/>
     </w:sectPr>
   </w:body>
 </w:document>
 </file>
 
+<file path=word/endnotes.xml><?xml version="1.0" encoding="utf-8"?>
+<w:endnotes xmlns:wpc="http://schemas.microsoft.com/office/word/2010/wordprocessingCanvas" xmlns:cx="http://schemas.microsoft.com/office/drawing/2014/chartex" xmlns:cx1="http://schemas.microsoft.com/office/drawing/2015/9/8/chartex" xmlns:cx2="http://schemas.microsoft.com/office/drawing/2015/10/21/chartex" xmlns:cx3="http://schemas.microsoft.com/office/drawing/2016/5/9/chartex" xmlns:cx4="http://schemas.microsoft.com/office/drawing/2016/5/10/chartex" xmlns:cx5="http://schemas.microsoft.com/office/drawing/2016/5/11/chartex" xmlns:cx6="http://schemas.microsoft.com/office/drawing/2016/5/12/chartex" xmlns:cx7="http://schemas.microsoft.com/office/drawing/2016/5/13/chartex" xmlns:cx8="http://schemas.microsoft.com/office/drawing/2016/5/14/chartex" xmlns:mc="http://schemas.openxmlformats.org/markup-compatibility/2006" xmlns:aink="http://schemas.microsoft.com/office/drawing/2016/ink" xmlns:am3d="http://schemas.microsoft.com/office/drawing/2017/model3d" xmlns:o="urn:schemas-microsoft-com:office:office" xmlns:oel="http://schemas.microsoft.com/office/2019/extlst" xmlns:r="http://schemas.openxmlformats.org/officeDocument/2006/relationships" xmlns:m="http://schemas.openxmlformats.org/officeDocument/2006/math" xmlns:v="urn:schemas-microsoft-com:vml" xmlns:wp14="http://schemas.microsoft.com/office/word/2010/wordprocessingDrawing" xmlns:wp="http://schemas.openxmlformats.org/drawingml/2006/wordprocessingDrawing" xmlns:w10="urn:schemas-microsoft-com:office:word" xmlns:w="http://schemas.openxmlformats.org/wordprocessingml/2006/main" xmlns:w14="http://schemas.microsoft.com/office/word/2010/wordml" xmlns:w15="http://schemas.microsoft.com/office/word/2012/wordml" xmlns:w16cex="http://schemas.microsoft.com/office/word/2018/wordml/cex" xmlns:w16cid="http://schemas.microsoft.com/office/word/2016/wordml/cid" xmlns:w16="http://schemas.microsoft.com/office/word/2018/wordml" xmlns:w16du="http://schemas.microsoft.com/office/word/2023/wordml/word16du" xmlns:w16sdtdh="http://schemas.microsoft.com/office/word/2020/wordml/sdtdatahash" xmlns:w16sdtfl="http://schemas.microsoft.com/office/word/2024/wordml/sdtformatlock" xmlns:w16se="http://schemas.microsoft.com/office/word/2015/wordml/symex" xmlns:wpg="http://schemas.microsoft.com/office/word/2010/wordprocessingGroup" xmlns:wpi="http://schemas.microsoft.com/office/word/2010/wordprocessingInk" xmlns:wne="http://schemas.microsoft.com/office/word/2006/wordml" xmlns:wps="http://schemas.microsoft.com/office/word/2010/wordprocessingShape" mc:Ignorable="w14 w15 w16se w16cid w16 w16cex w16sdtdh w16sdtfl w16du wp14">
+  <w:endnote w:type="separator" w:id="-1">
+    <w:p>
+      <w:r>
+        <w:separator/>
+      </w:r>
+    </w:p>
+  </w:endnote>
+  <w:endnote w:type="continuationSeparator" w:id="0">
+    <w:p>
+      <w:r>
+        <w:continuationSeparator/>
+      </w:r>
+    </w:p>
+  </w:endnote>
+</w:endnotes>
+</file>
+
 <file path=word/footer1.xml><?xml version="1.0" encoding="utf-8"?>
-<w:ftr xmlns:wpc="http://schemas.microsoft.com/office/word/2010/wordprocessingCanvas" xmlns:cx="http://schemas.microsoft.com/office/drawing/2014/chartex" xmlns:cx1="http://schemas.microsoft.com/office/drawing/2015/9/8/chartex" xmlns:cx2="http://schemas.microsoft.com/office/drawing/2015/10/21/chartex" xmlns:cx3="http://schemas.microsoft.com/office/drawing/2016/5/9/chartex" xmlns:cx4="http://schemas.microsoft.com/office/drawing/2016/5/10/chartex" xmlns:cx5="http://schemas.microsoft.com/office/drawing/2016/5/11/chartex" xmlns:mc="http://schemas.openxmlformats.org/markup-compatibility/2006" xmlns:o="urn:schemas-microsoft-com:office:office" xmlns:r="http://schemas.openxmlformats.org/officeDocument/2006/relationships" xmlns:m="http://schemas.openxmlformats.org/officeDocument/2006/math" xmlns:v="urn:schemas-microsoft-com:vml" xmlns:wp14="http://schemas.microsoft.com/office/word/2010/wordprocessingDrawing" xmlns:wp="http://schemas.openxmlformats.org/drawingml/2006/wordprocessingDrawing" xmlns:w10="urn:schemas-microsoft-com:office:word" xmlns:w="http://schemas.openxmlformats.org/wordprocessingml/2006/main" xmlns:w14="http://schemas.microsoft.com/office/word/2010/wordml" xmlns:w15="http://schemas.microsoft.com/office/word/2012/wordml" xmlns:wne="http://schemas.microsoft.com/office/word/2006/wordml" xmlns:w16cid="http://schemas.microsoft.com/office/word/2016/wordml/cid" xmlns:w16se="http://schemas.microsoft.com/office/word/2015/wordml/symex" xmlns:wpg="http://schemas.microsoft.com/office/word/2010/wordprocessingGroup" xmlns:wpi="http://schemas.microsoft.com/office/word/2010/wordprocessingInk" xmlns:wps="http://schemas.microsoft.com/office/word/2010/wordprocessingShape" mc:Ignorable="w14 w15 wp14 w16se w16cid">
+<w:ftr xmlns:wpc="http://schemas.microsoft.com/office/word/2010/wordprocessingCanvas" xmlns:cx="http://schemas.microsoft.com/office/drawing/2014/chartex" xmlns:cx1="http://schemas.microsoft.com/office/drawing/2015/9/8/chartex" xmlns:cx2="http://schemas.microsoft.com/office/drawing/2015/10/21/chartex" xmlns:cx3="http://schemas.microsoft.com/office/drawing/2016/5/9/chartex" xmlns:cx4="http://schemas.microsoft.com/office/drawing/2016/5/10/chartex" xmlns:cx5="http://schemas.microsoft.com/office/drawing/2016/5/11/chartex" xmlns:cx6="http://schemas.microsoft.com/office/drawing/2016/5/12/chartex" xmlns:cx7="http://schemas.microsoft.com/office/drawing/2016/5/13/chartex" xmlns:cx8="http://schemas.microsoft.com/office/drawing/2016/5/14/chartex" xmlns:mc="http://schemas.openxmlformats.org/markup-compatibility/2006" xmlns:aink="http://schemas.microsoft.com/office/drawing/2016/ink" xmlns:am3d="http://schemas.microsoft.com/office/drawing/2017/model3d" xmlns:o="urn:schemas-microsoft-com:office:office" xmlns:oel="http://schemas.microsoft.com/office/2019/extlst" xmlns:r="http://schemas.openxmlformats.org/officeDocument/2006/relationships" xmlns:m="http://schemas.openxmlformats.org/officeDocument/2006/math" xmlns:v="urn:schemas-microsoft-com:vml" xmlns:wp14="http://schemas.microsoft.com/office/word/2010/wordprocessingDrawing" xmlns:wp="http://schemas.openxmlformats.org/drawingml/2006/wordprocessingDrawing" xmlns:w10="urn:schemas-microsoft-com:office:word" xmlns:w="http://schemas.openxmlformats.org/wordprocessingml/2006/main" xmlns:w14="http://schemas.microsoft.com/office/word/2010/wordml" xmlns:w15="http://schemas.microsoft.com/office/word/2012/wordml" xmlns:w16cex="http://schemas.microsoft.com/office/word/2018/wordml/cex" xmlns:w16cid="http://schemas.microsoft.com/office/word/2016/wordml/cid" xmlns:w16="http://schemas.microsoft.com/office/word/2018/wordml" xmlns:w16du="http://schemas.microsoft.com/office/word/2023/wordml/word16du" xmlns:w16sdtdh="http://schemas.microsoft.com/office/word/2020/wordml/sdtdatahash" xmlns:w16sdtfl="http://schemas.microsoft.com/office/word/2024/wordml/sdtformatlock" xmlns:w16se="http://schemas.microsoft.com/office/word/2015/wordml/symex" xmlns:wpg="http://schemas.microsoft.com/office/word/2010/wordprocessingGroup" xmlns:wpi="http://schemas.microsoft.com/office/word/2010/wordprocessingInk" xmlns:wne="http://schemas.microsoft.com/office/word/2006/wordml" xmlns:wps="http://schemas.microsoft.com/office/word/2010/wordprocessingShape" mc:Ignorable="w14 w15 w16se w16cid w16 w16cex w16sdtdh w16sdtfl w16du wp14">
   <w:p>
     <w:pPr>
       <w:pBdr>
@@ -2632,22 +2807,33 @@
         <w:sz w:val="16"/>
         <w:szCs w:val="16"/>
       </w:rPr>
-      <w:t xml:space="preserve"> de </w:t>
-    </w:r>
-    <w:r>
-      <w:rPr>
-        <w:color w:val="565354"/>
-        <w:sz w:val="16"/>
-        <w:szCs w:val="16"/>
-      </w:rPr>
-      <w:t>19</w:t>
+      <w:t xml:space="preserve"> de 19</w:t>
     </w:r>
   </w:p>
 </w:ftr>
 </file>
 
+<file path=word/footnotes.xml><?xml version="1.0" encoding="utf-8"?>
+<w:footnotes xmlns:wpc="http://schemas.microsoft.com/office/word/2010/wordprocessingCanvas" xmlns:cx="http://schemas.microsoft.com/office/drawing/2014/chartex" xmlns:cx1="http://schemas.microsoft.com/office/drawing/2015/9/8/chartex" xmlns:cx2="http://schemas.microsoft.com/office/drawing/2015/10/21/chartex" xmlns:cx3="http://schemas.microsoft.com/office/drawing/2016/5/9/chartex" xmlns:cx4="http://schemas.microsoft.com/office/drawing/2016/5/10/chartex" xmlns:cx5="http://schemas.microsoft.com/office/drawing/2016/5/11/chartex" xmlns:cx6="http://schemas.microsoft.com/office/drawing/2016/5/12/chartex" xmlns:cx7="http://schemas.microsoft.com/office/drawing/2016/5/13/chartex" xmlns:cx8="http://schemas.microsoft.com/office/drawing/2016/5/14/chartex" xmlns:mc="http://schemas.openxmlformats.org/markup-compatibility/2006" xmlns:aink="http://schemas.microsoft.com/office/drawing/2016/ink" xmlns:am3d="http://schemas.microsoft.com/office/drawing/2017/model3d" xmlns:o="urn:schemas-microsoft-com:office:office" xmlns:oel="http://schemas.microsoft.com/office/2019/extlst" xmlns:r="http://schemas.openxmlformats.org/officeDocument/2006/relationships" xmlns:m="http://schemas.openxmlformats.org/officeDocument/2006/math" xmlns:v="urn:schemas-microsoft-com:vml" xmlns:wp14="http://schemas.microsoft.com/office/word/2010/wordprocessingDrawing" xmlns:wp="http://schemas.openxmlformats.org/drawingml/2006/wordprocessingDrawing" xmlns:w10="urn:schemas-microsoft-com:office:word" xmlns:w="http://schemas.openxmlformats.org/wordprocessingml/2006/main" xmlns:w14="http://schemas.microsoft.com/office/word/2010/wordml" xmlns:w15="http://schemas.microsoft.com/office/word/2012/wordml" xmlns:w16cex="http://schemas.microsoft.com/office/word/2018/wordml/cex" xmlns:w16cid="http://schemas.microsoft.com/office/word/2016/wordml/cid" xmlns:w16="http://schemas.microsoft.com/office/word/2018/wordml" xmlns:w16du="http://schemas.microsoft.com/office/word/2023/wordml/word16du" xmlns:w16sdtdh="http://schemas.microsoft.com/office/word/2020/wordml/sdtdatahash" xmlns:w16sdtfl="http://schemas.microsoft.com/office/word/2024/wordml/sdtformatlock" xmlns:w16se="http://schemas.microsoft.com/office/word/2015/wordml/symex" xmlns:wpg="http://schemas.microsoft.com/office/word/2010/wordprocessingGroup" xmlns:wpi="http://schemas.microsoft.com/office/word/2010/wordprocessingInk" xmlns:wne="http://schemas.microsoft.com/office/word/2006/wordml" xmlns:wps="http://schemas.microsoft.com/office/word/2010/wordprocessingShape" mc:Ignorable="w14 w15 w16se w16cid w16 w16cex w16sdtdh w16sdtfl w16du wp14">
+  <w:footnote w:type="separator" w:id="-1">
+    <w:p>
+      <w:r>
+        <w:separator/>
+      </w:r>
+    </w:p>
+  </w:footnote>
+  <w:footnote w:type="continuationSeparator" w:id="0">
+    <w:p>
+      <w:r>
+        <w:continuationSeparator/>
+      </w:r>
+    </w:p>
+  </w:footnote>
+</w:footnotes>
+</file>
+
 <file path=word/header1.xml><?xml version="1.0" encoding="utf-8"?>
-<w:hdr xmlns:wpc="http://schemas.microsoft.com/office/word/2010/wordprocessingCanvas" xmlns:cx="http://schemas.microsoft.com/office/drawing/2014/chartex" xmlns:cx1="http://schemas.microsoft.com/office/drawing/2015/9/8/chartex" xmlns:cx2="http://schemas.microsoft.com/office/drawing/2015/10/21/chartex" xmlns:cx3="http://schemas.microsoft.com/office/drawing/2016/5/9/chartex" xmlns:cx4="http://schemas.microsoft.com/office/drawing/2016/5/10/chartex" xmlns:cx5="http://schemas.microsoft.com/office/drawing/2016/5/11/chartex" xmlns:mc="http://schemas.openxmlformats.org/markup-compatibility/2006" xmlns:o="urn:schemas-microsoft-com:office:office" xmlns:r="http://schemas.openxmlformats.org/officeDocument/2006/relationships" xmlns:m="http://schemas.openxmlformats.org/officeDocument/2006/math" xmlns:v="urn:schemas-microsoft-com:vml" xmlns:wp14="http://schemas.microsoft.com/office/word/2010/wordprocessingDrawing" xmlns:wp="http://schemas.openxmlformats.org/drawingml/2006/wordprocessingDrawing" xmlns:w10="urn:schemas-microsoft-com:office:word" xmlns:w="http://schemas.openxmlformats.org/wordprocessingml/2006/main" xmlns:w14="http://schemas.microsoft.com/office/word/2010/wordml" xmlns:w15="http://schemas.microsoft.com/office/word/2012/wordml" xmlns:wne="http://schemas.microsoft.com/office/word/2006/wordml" xmlns:w16cid="http://schemas.microsoft.com/office/word/2016/wordml/cid" xmlns:w16se="http://schemas.microsoft.com/office/word/2015/wordml/symex" xmlns:wpg="http://schemas.microsoft.com/office/word/2010/wordprocessingGroup" xmlns:wpi="http://schemas.microsoft.com/office/word/2010/wordprocessingInk" xmlns:wps="http://schemas.microsoft.com/office/word/2010/wordprocessingShape" mc:Ignorable="w14 w15 wp14 w16se w16cid">
+<w:hdr xmlns:wpc="http://schemas.microsoft.com/office/word/2010/wordprocessingCanvas" xmlns:cx="http://schemas.microsoft.com/office/drawing/2014/chartex" xmlns:cx1="http://schemas.microsoft.com/office/drawing/2015/9/8/chartex" xmlns:cx2="http://schemas.microsoft.com/office/drawing/2015/10/21/chartex" xmlns:cx3="http://schemas.microsoft.com/office/drawing/2016/5/9/chartex" xmlns:cx4="http://schemas.microsoft.com/office/drawing/2016/5/10/chartex" xmlns:cx5="http://schemas.microsoft.com/office/drawing/2016/5/11/chartex" xmlns:cx6="http://schemas.microsoft.com/office/drawing/2016/5/12/chartex" xmlns:cx7="http://schemas.microsoft.com/office/drawing/2016/5/13/chartex" xmlns:cx8="http://schemas.microsoft.com/office/drawing/2016/5/14/chartex" xmlns:mc="http://schemas.openxmlformats.org/markup-compatibility/2006" xmlns:aink="http://schemas.microsoft.com/office/drawing/2016/ink" xmlns:am3d="http://schemas.microsoft.com/office/drawing/2017/model3d" xmlns:o="urn:schemas-microsoft-com:office:office" xmlns:oel="http://schemas.microsoft.com/office/2019/extlst" xmlns:r="http://schemas.openxmlformats.org/officeDocument/2006/relationships" xmlns:m="http://schemas.openxmlformats.org/officeDocument/2006/math" xmlns:v="urn:schemas-microsoft-com:vml" xmlns:wp14="http://schemas.microsoft.com/office/word/2010/wordprocessingDrawing" xmlns:wp="http://schemas.openxmlformats.org/drawingml/2006/wordprocessingDrawing" xmlns:w10="urn:schemas-microsoft-com:office:word" xmlns:w="http://schemas.openxmlformats.org/wordprocessingml/2006/main" xmlns:w14="http://schemas.microsoft.com/office/word/2010/wordml" xmlns:w15="http://schemas.microsoft.com/office/word/2012/wordml" xmlns:w16cex="http://schemas.microsoft.com/office/word/2018/wordml/cex" xmlns:w16cid="http://schemas.microsoft.com/office/word/2016/wordml/cid" xmlns:w16="http://schemas.microsoft.com/office/word/2018/wordml" xmlns:w16du="http://schemas.microsoft.com/office/word/2023/wordml/word16du" xmlns:w16sdtdh="http://schemas.microsoft.com/office/word/2020/wordml/sdtdatahash" xmlns:w16sdtfl="http://schemas.microsoft.com/office/word/2024/wordml/sdtformatlock" xmlns:w16se="http://schemas.microsoft.com/office/word/2015/wordml/symex" xmlns:wpg="http://schemas.microsoft.com/office/word/2010/wordprocessingGroup" xmlns:wpi="http://schemas.microsoft.com/office/word/2010/wordprocessingInk" xmlns:wne="http://schemas.microsoft.com/office/word/2006/wordml" xmlns:wps="http://schemas.microsoft.com/office/word/2010/wordprocessingShape" mc:Ignorable="w14 w15 w16se w16cid w16 w16cex w16sdtdh w16sdtfl w16du wp14">
   <w:tbl>
     <w:tblPr>
       <w:tblW w:w="9360" w:type="dxa"/>
@@ -2663,16 +2849,12 @@
         <w:left w:w="10" w:type="dxa"/>
         <w:right w:w="10" w:type="dxa"/>
       </w:tblCellMar>
-      <w:tblLook w:val="04A0"/>
+      <w:tblLook w:val="04A0" w:firstRow="1" w:lastRow="0" w:firstColumn="1" w:lastColumn="0" w:noHBand="0" w:noVBand="1"/>
     </w:tblPr>
     <w:tblGrid>
       <w:gridCol w:w="9360"/>
     </w:tblGrid>
     <w:tr>
-      <w:tblPrEx>
-        <w:tblW w:w="9360" w:type="dxa"/>
-        <w:tblLook w:val="04A0"/>
-      </w:tblPrEx>
       <w:tc>
         <w:tcPr>
           <w:tcW w:w="9360" w:type="dxa"/>
@@ -2740,12 +2922,12 @@
 </file>
 
 <file path=word/numbering.xml><?xml version="1.0" encoding="utf-8"?>
-<w:numbering xmlns:wpc="http://schemas.microsoft.com/office/word/2010/wordprocessingCanvas" xmlns:cx="http://schemas.microsoft.com/office/drawing/2014/chartex" xmlns:cx1="http://schemas.microsoft.com/office/drawing/2015/9/8/chartex" xmlns:cx2="http://schemas.microsoft.com/office/drawing/2015/10/21/chartex" xmlns:cx3="http://schemas.microsoft.com/office/drawing/2016/5/9/chartex" xmlns:cx4="http://schemas.microsoft.com/office/drawing/2016/5/10/chartex" xmlns:cx5="http://schemas.microsoft.com/office/drawing/2016/5/11/chartex" xmlns:mc="http://schemas.openxmlformats.org/markup-compatibility/2006" xmlns:o="urn:schemas-microsoft-com:office:office" xmlns:r="http://schemas.openxmlformats.org/officeDocument/2006/relationships" xmlns:m="http://schemas.openxmlformats.org/officeDocument/2006/math" xmlns:v="urn:schemas-microsoft-com:vml" xmlns:wp14="http://schemas.microsoft.com/office/word/2010/wordprocessingDrawing" xmlns:wp="http://schemas.openxmlformats.org/drawingml/2006/wordprocessingDrawing" xmlns:w10="urn:schemas-microsoft-com:office:word" xmlns:w="http://schemas.openxmlformats.org/wordprocessingml/2006/main" xmlns:w14="http://schemas.microsoft.com/office/word/2010/wordml" xmlns:w15="http://schemas.microsoft.com/office/word/2012/wordml" xmlns:wne="http://schemas.microsoft.com/office/word/2006/wordml" xmlns:w16cid="http://schemas.microsoft.com/office/word/2016/wordml/cid" xmlns:w16se="http://schemas.microsoft.com/office/word/2015/wordml/symex" xmlns:wpg="http://schemas.microsoft.com/office/word/2010/wordprocessingGroup" xmlns:wpi="http://schemas.microsoft.com/office/word/2010/wordprocessingInk" xmlns:wps="http://schemas.microsoft.com/office/word/2010/wordprocessingShape" mc:Ignorable="w14 w15 wp14 w16se w16cid">
+<w:numbering xmlns:wpc="http://schemas.microsoft.com/office/word/2010/wordprocessingCanvas" xmlns:cx="http://schemas.microsoft.com/office/drawing/2014/chartex" xmlns:cx1="http://schemas.microsoft.com/office/drawing/2015/9/8/chartex" xmlns:cx2="http://schemas.microsoft.com/office/drawing/2015/10/21/chartex" xmlns:cx3="http://schemas.microsoft.com/office/drawing/2016/5/9/chartex" xmlns:cx4="http://schemas.microsoft.com/office/drawing/2016/5/10/chartex" xmlns:cx5="http://schemas.microsoft.com/office/drawing/2016/5/11/chartex" xmlns:cx6="http://schemas.microsoft.com/office/drawing/2016/5/12/chartex" xmlns:cx7="http://schemas.microsoft.com/office/drawing/2016/5/13/chartex" xmlns:cx8="http://schemas.microsoft.com/office/drawing/2016/5/14/chartex" xmlns:mc="http://schemas.openxmlformats.org/markup-compatibility/2006" xmlns:aink="http://schemas.microsoft.com/office/drawing/2016/ink" xmlns:am3d="http://schemas.microsoft.com/office/drawing/2017/model3d" xmlns:o="urn:schemas-microsoft-com:office:office" xmlns:oel="http://schemas.microsoft.com/office/2019/extlst" xmlns:r="http://schemas.openxmlformats.org/officeDocument/2006/relationships" xmlns:m="http://schemas.openxmlformats.org/officeDocument/2006/math" xmlns:v="urn:schemas-microsoft-com:vml" xmlns:wp14="http://schemas.microsoft.com/office/word/2010/wordprocessingDrawing" xmlns:wp="http://schemas.openxmlformats.org/drawingml/2006/wordprocessingDrawing" xmlns:w10="urn:schemas-microsoft-com:office:word" xmlns:w="http://schemas.openxmlformats.org/wordprocessingml/2006/main" xmlns:w14="http://schemas.microsoft.com/office/word/2010/wordml" xmlns:w15="http://schemas.microsoft.com/office/word/2012/wordml" xmlns:w16cex="http://schemas.microsoft.com/office/word/2018/wordml/cex" xmlns:w16cid="http://schemas.microsoft.com/office/word/2016/wordml/cid" xmlns:w16="http://schemas.microsoft.com/office/word/2018/wordml" xmlns:w16du="http://schemas.microsoft.com/office/word/2023/wordml/word16du" xmlns:w16sdtdh="http://schemas.microsoft.com/office/word/2020/wordml/sdtdatahash" xmlns:w16sdtfl="http://schemas.microsoft.com/office/word/2024/wordml/sdtformatlock" xmlns:w16se="http://schemas.microsoft.com/office/word/2015/wordml/symex" xmlns:wpg="http://schemas.microsoft.com/office/word/2010/wordprocessingGroup" xmlns:wpi="http://schemas.microsoft.com/office/word/2010/wordprocessingInk" xmlns:wne="http://schemas.microsoft.com/office/word/2006/wordml" xmlns:wps="http://schemas.microsoft.com/office/word/2010/wordprocessingShape" mc:Ignorable="w14 w15 w16se w16cid w16 w16cex w16sdtdh w16sdtfl w16du wp14">
   <w:abstractNum w:abstractNumId="0" w15:restartNumberingAfterBreak="0">
     <w:nsid w:val="3F513B5B"/>
     <w:multiLevelType w:val="hybridMultilevel"/>
     <w:tmpl w:val="7EA02254"/>
-    <w:lvl w:ilvl="0">
+    <w:lvl w:ilvl="0" w:tplc="A412B61C">
       <w:start w:val="1"/>
       <w:numFmt w:val="bullet"/>
       <w:lvlText w:val="●"/>
@@ -2754,7 +2936,7 @@
         <w:ind w:left="720" w:hanging="360"/>
       </w:pPr>
     </w:lvl>
-    <w:lvl w:ilvl="1">
+    <w:lvl w:ilvl="1" w:tplc="D61C87B8">
       <w:start w:val="1"/>
       <w:numFmt w:val="bullet"/>
       <w:lvlText w:val="○"/>
@@ -2763,7 +2945,7 @@
         <w:ind w:left="1440" w:hanging="360"/>
       </w:pPr>
     </w:lvl>
-    <w:lvl w:ilvl="2">
+    <w:lvl w:ilvl="2" w:tplc="451214CE">
       <w:start w:val="1"/>
       <w:numFmt w:val="bullet"/>
       <w:lvlText w:val="■"/>
@@ -2772,7 +2954,7 @@
         <w:ind w:left="2160" w:hanging="360"/>
       </w:pPr>
     </w:lvl>
-    <w:lvl w:ilvl="3">
+    <w:lvl w:ilvl="3" w:tplc="5FCEFB7A">
       <w:start w:val="1"/>
       <w:numFmt w:val="bullet"/>
       <w:lvlText w:val="●"/>
@@ -2781,7 +2963,7 @@
         <w:ind w:left="2880" w:hanging="360"/>
       </w:pPr>
     </w:lvl>
-    <w:lvl w:ilvl="4">
+    <w:lvl w:ilvl="4" w:tplc="1E7AB412">
       <w:start w:val="1"/>
       <w:numFmt w:val="bullet"/>
       <w:lvlText w:val="○"/>
@@ -2790,7 +2972,7 @@
         <w:ind w:left="3600" w:hanging="360"/>
       </w:pPr>
     </w:lvl>
-    <w:lvl w:ilvl="5">
+    <w:lvl w:ilvl="5" w:tplc="94FE5440">
       <w:start w:val="1"/>
       <w:numFmt w:val="bullet"/>
       <w:lvlText w:val="■"/>
@@ -2799,7 +2981,7 @@
         <w:ind w:left="4320" w:hanging="360"/>
       </w:pPr>
     </w:lvl>
-    <w:lvl w:ilvl="6">
+    <w:lvl w:ilvl="6" w:tplc="81F04472">
       <w:start w:val="1"/>
       <w:numFmt w:val="bullet"/>
       <w:lvlText w:val="●"/>
@@ -2808,7 +2990,7 @@
         <w:ind w:left="5040" w:hanging="360"/>
       </w:pPr>
     </w:lvl>
-    <w:lvl w:ilvl="7">
+    <w:lvl w:ilvl="7" w:tplc="5CB2AB66">
       <w:start w:val="1"/>
       <w:numFmt w:val="bullet"/>
       <w:lvlText w:val="●"/>
@@ -2817,7 +2999,7 @@
         <w:ind w:left="5760" w:hanging="360"/>
       </w:pPr>
     </w:lvl>
-    <w:lvl w:ilvl="8">
+    <w:lvl w:ilvl="8" w:tplc="FAD08C0A">
       <w:start w:val="1"/>
       <w:numFmt w:val="bullet"/>
       <w:lvlText w:val="●"/>
@@ -2831,7 +3013,7 @@
     <w:nsid w:val="6C6E06C4"/>
     <w:multiLevelType w:val="hybridMultilevel"/>
     <w:tmpl w:val="5C0A495A"/>
-    <w:lvl w:ilvl="0">
+    <w:lvl w:ilvl="0" w:tplc="964A3AEA">
       <w:start w:val="1"/>
       <w:numFmt w:val="bullet"/>
       <w:lvlText w:val="•"/>
@@ -2840,44 +3022,44 @@
         <w:ind w:left="540" w:hanging="270"/>
       </w:pPr>
     </w:lvl>
-    <w:lvl w:ilvl="1">
-      <w:start w:val="0"/>
+    <w:lvl w:ilvl="1" w:tplc="829C417E">
       <w:numFmt w:val="decimal"/>
+      <w:lvlText w:val=""/>
       <w:lvlJc w:val="left"/>
     </w:lvl>
-    <w:lvl w:ilvl="2">
-      <w:start w:val="0"/>
+    <w:lvl w:ilvl="2" w:tplc="F5509DDC">
       <w:numFmt w:val="decimal"/>
+      <w:lvlText w:val=""/>
       <w:lvlJc w:val="left"/>
     </w:lvl>
-    <w:lvl w:ilvl="3">
-      <w:start w:val="0"/>
+    <w:lvl w:ilvl="3" w:tplc="950EC710">
       <w:numFmt w:val="decimal"/>
+      <w:lvlText w:val=""/>
       <w:lvlJc w:val="left"/>
     </w:lvl>
-    <w:lvl w:ilvl="4">
-      <w:start w:val="0"/>
+    <w:lvl w:ilvl="4" w:tplc="39AE3C4E">
       <w:numFmt w:val="decimal"/>
+      <w:lvlText w:val=""/>
       <w:lvlJc w:val="left"/>
     </w:lvl>
-    <w:lvl w:ilvl="5">
-      <w:start w:val="0"/>
+    <w:lvl w:ilvl="5" w:tplc="C772F5D2">
       <w:numFmt w:val="decimal"/>
+      <w:lvlText w:val=""/>
       <w:lvlJc w:val="left"/>
     </w:lvl>
-    <w:lvl w:ilvl="6">
-      <w:start w:val="0"/>
+    <w:lvl w:ilvl="6" w:tplc="10A030D6">
       <w:numFmt w:val="decimal"/>
+      <w:lvlText w:val=""/>
       <w:lvlJc w:val="left"/>
     </w:lvl>
-    <w:lvl w:ilvl="7">
-      <w:start w:val="0"/>
+    <w:lvl w:ilvl="7" w:tplc="E0A4B3EE">
       <w:numFmt w:val="decimal"/>
+      <w:lvlText w:val=""/>
       <w:lvlJc w:val="left"/>
     </w:lvl>
-    <w:lvl w:ilvl="8">
-      <w:start w:val="0"/>
+    <w:lvl w:ilvl="8" w:tplc="45F2A040">
       <w:numFmt w:val="decimal"/>
+      <w:lvlText w:val=""/>
       <w:lvlJc w:val="left"/>
     </w:lvl>
   </w:abstractNum>
@@ -2897,7 +3079,7 @@
 </file>
 
 <file path=word/styles.xml><?xml version="1.0" encoding="utf-8"?>
-<w:styles xmlns:mc="http://schemas.openxmlformats.org/markup-compatibility/2006" xmlns:r="http://schemas.openxmlformats.org/officeDocument/2006/relationships" xmlns:w="http://schemas.openxmlformats.org/wordprocessingml/2006/main" xmlns:w14="http://schemas.microsoft.com/office/word/2010/wordml" xmlns:w15="http://schemas.microsoft.com/office/word/2012/wordml" xmlns:w16cid="http://schemas.microsoft.com/office/word/2016/wordml/cid" xmlns:w16se="http://schemas.microsoft.com/office/word/2015/wordml/symex" mc:Ignorable="w14 w15 w16se w16cid">
+<w:styles xmlns:mc="http://schemas.openxmlformats.org/markup-compatibility/2006" xmlns:r="http://schemas.openxmlformats.org/officeDocument/2006/relationships" xmlns:w="http://schemas.openxmlformats.org/wordprocessingml/2006/main" xmlns:w14="http://schemas.microsoft.com/office/word/2010/wordml" xmlns:w15="http://schemas.microsoft.com/office/word/2012/wordml" xmlns:w16cex="http://schemas.microsoft.com/office/word/2018/wordml/cex" xmlns:w16cid="http://schemas.microsoft.com/office/word/2016/wordml/cid" xmlns:w16="http://schemas.microsoft.com/office/word/2018/wordml" xmlns:w16du="http://schemas.microsoft.com/office/word/2023/wordml/word16du" xmlns:w16sdtdh="http://schemas.microsoft.com/office/word/2020/wordml/sdtdatahash" xmlns:w16sdtfl="http://schemas.microsoft.com/office/word/2024/wordml/sdtformatlock" xmlns:w16se="http://schemas.microsoft.com/office/word/2015/wordml/symex" mc:Ignorable="w14 w15 w16se w16cid w16 w16cex w16sdtdh w16sdtfl w16du">
   <w:docDefaults>
     <w:rPrDefault>
       <w:rPr>
@@ -3281,17 +3463,17 @@
     <w:lsdException w:name="List Table 5 Dark Accent 6" w:uiPriority="50"/>
     <w:lsdException w:name="List Table 6 Colorful Accent 6" w:uiPriority="51"/>
     <w:lsdException w:name="List Table 7 Colorful Accent 6" w:uiPriority="52"/>
-    <w:lsdException w:name="Smart Link" w:semiHidden="1" w:unhideWhenUsed="1"/>
     <w:lsdException w:name="Mention" w:semiHidden="1" w:unhideWhenUsed="1"/>
     <w:lsdException w:name="Smart Hyperlink" w:semiHidden="1" w:unhideWhenUsed="1"/>
     <w:lsdException w:name="Hashtag" w:semiHidden="1" w:unhideWhenUsed="1"/>
     <w:lsdException w:name="Unresolved Mention" w:semiHidden="1" w:unhideWhenUsed="1"/>
+    <w:lsdException w:name="Smart Link" w:semiHidden="1" w:unhideWhenUsed="1"/>
   </w:latentStyles>
   <w:style w:type="paragraph" w:default="1" w:styleId="Normal">
     <w:name w:val="Normal"/>
     <w:qFormat/>
   </w:style>
-  <w:style w:type="paragraph" w:styleId="Heading1">
+  <w:style w:type="paragraph" w:styleId="Ttulo1">
     <w:name w:val="heading 1"/>
     <w:uiPriority w:val="9"/>
     <w:qFormat/>
@@ -3307,7 +3489,7 @@
       <w:szCs w:val="32"/>
     </w:rPr>
   </w:style>
-  <w:style w:type="paragraph" w:styleId="Heading2">
+  <w:style w:type="paragraph" w:styleId="Ttulo2">
     <w:name w:val="heading 2"/>
     <w:uiPriority w:val="9"/>
     <w:unhideWhenUsed/>
@@ -3324,7 +3506,7 @@
       <w:szCs w:val="26"/>
     </w:rPr>
   </w:style>
-  <w:style w:type="paragraph" w:styleId="Heading3">
+  <w:style w:type="paragraph" w:styleId="Ttulo3">
     <w:name w:val="heading 3"/>
     <w:uiPriority w:val="9"/>
     <w:semiHidden/>
@@ -3342,7 +3524,7 @@
       <w:szCs w:val="24"/>
     </w:rPr>
   </w:style>
-  <w:style w:type="paragraph" w:styleId="Heading4">
+  <w:style w:type="paragraph" w:styleId="Ttulo4">
     <w:name w:val="heading 4"/>
     <w:uiPriority w:val="9"/>
     <w:semiHidden/>
@@ -3357,7 +3539,7 @@
       <w:color w:val="2E74B5"/>
     </w:rPr>
   </w:style>
-  <w:style w:type="paragraph" w:styleId="Heading5">
+  <w:style w:type="paragraph" w:styleId="Ttulo5">
     <w:name w:val="heading 5"/>
     <w:uiPriority w:val="9"/>
     <w:semiHidden/>
@@ -3370,7 +3552,7 @@
       <w:color w:val="2E74B5"/>
     </w:rPr>
   </w:style>
-  <w:style w:type="paragraph" w:styleId="Heading6">
+  <w:style w:type="paragraph" w:styleId="Ttulo6">
     <w:name w:val="heading 6"/>
     <w:uiPriority w:val="9"/>
     <w:semiHidden/>
@@ -3383,13 +3565,13 @@
       <w:color w:val="1F4D78"/>
     </w:rPr>
   </w:style>
-  <w:style w:type="character" w:default="1" w:styleId="DefaultParagraphFont">
+  <w:style w:type="character" w:default="1" w:styleId="Fuentedeprrafopredeter">
     <w:name w:val="Default Paragraph Font"/>
     <w:uiPriority w:val="1"/>
     <w:semiHidden/>
     <w:unhideWhenUsed/>
   </w:style>
-  <w:style w:type="table" w:default="1" w:styleId="TableNormal">
+  <w:style w:type="table" w:default="1" w:styleId="Tablanormal">
     <w:name w:val="Normal Table"/>
     <w:uiPriority w:val="99"/>
     <w:semiHidden/>
@@ -3404,13 +3586,13 @@
       </w:tblCellMar>
     </w:tblPr>
   </w:style>
-  <w:style w:type="numbering" w:default="1" w:styleId="NoList">
+  <w:style w:type="numbering" w:default="1" w:styleId="Sinlista">
     <w:name w:val="No List"/>
     <w:uiPriority w:val="99"/>
     <w:semiHidden/>
     <w:unhideWhenUsed/>
   </w:style>
-  <w:style w:type="paragraph" w:styleId="Title">
+  <w:style w:type="paragraph" w:styleId="Ttulo">
     <w:name w:val="Title"/>
     <w:uiPriority w:val="10"/>
     <w:qFormat/>
@@ -3427,11 +3609,11 @@
       <w:bCs/>
     </w:rPr>
   </w:style>
-  <w:style w:type="paragraph" w:styleId="ListParagraph">
+  <w:style w:type="paragraph" w:styleId="Prrafodelista">
     <w:name w:val="List Paragraph"/>
     <w:qFormat/>
   </w:style>
-  <w:style w:type="character" w:styleId="Hyperlink">
+  <w:style w:type="character" w:styleId="Hipervnculo">
     <w:name w:val="Hyperlink"/>
     <w:uiPriority w:val="99"/>
     <w:unhideWhenUsed/>
@@ -3440,7 +3622,7 @@
       <w:u w:val="single"/>
     </w:rPr>
   </w:style>
-  <w:style w:type="character" w:styleId="FootnoteReference">
+  <w:style w:type="character" w:styleId="Refdenotaalpie">
     <w:name w:val="footnote reference"/>
     <w:uiPriority w:val="99"/>
     <w:semiHidden/>
@@ -3449,9 +3631,9 @@
       <w:vertAlign w:val="superscript"/>
     </w:rPr>
   </w:style>
-  <w:style w:type="paragraph" w:styleId="FootnoteText">
+  <w:style w:type="paragraph" w:styleId="Textonotapie">
     <w:name w:val="footnote text"/>
-    <w:link w:val="FootnoteTextChar"/>
+    <w:link w:val="TextonotapieCar"/>
     <w:uiPriority w:val="99"/>
     <w:semiHidden/>
     <w:unhideWhenUsed/>
@@ -3460,9 +3642,9 @@
       <w:szCs w:val="20"/>
     </w:rPr>
   </w:style>
-  <w:style w:type="character" w:customStyle="1" w:styleId="FootnoteTextChar">
-    <w:name w:val="Footnote Text Char"/>
-    <w:link w:val="FootnoteText"/>
+  <w:style w:type="character" w:customStyle="1" w:styleId="TextonotapieCar">
+    <w:name w:val="Texto nota pie Car"/>
+    <w:link w:val="Textonotapie"/>
     <w:uiPriority w:val="99"/>
     <w:semiHidden/>
     <w:unhideWhenUsed/>
@@ -3471,7 +3653,7 @@
       <w:szCs w:val="20"/>
     </w:rPr>
   </w:style>
-  <w:style w:type="character" w:styleId="EndnoteReference">
+  <w:style w:type="character" w:styleId="Refdenotaalfinal">
     <w:name w:val="endnote reference"/>
     <w:uiPriority w:val="99"/>
     <w:semiHidden/>
@@ -3480,9 +3662,9 @@
       <w:vertAlign w:val="superscript"/>
     </w:rPr>
   </w:style>
-  <w:style w:type="paragraph" w:styleId="EndnoteText">
+  <w:style w:type="paragraph" w:styleId="Textonotaalfinal">
     <w:name w:val="endnote text"/>
-    <w:link w:val="EndnoteTextChar"/>
+    <w:link w:val="TextonotaalfinalCar"/>
     <w:uiPriority w:val="99"/>
     <w:semiHidden/>
     <w:unhideWhenUsed/>
@@ -3491,15 +3673,27 @@
       <w:szCs w:val="20"/>
     </w:rPr>
   </w:style>
-  <w:style w:type="character" w:customStyle="1" w:styleId="EndnoteTextChar">
-    <w:name w:val="Endnote Text Char"/>
-    <w:link w:val="EndnoteText"/>
+  <w:style w:type="character" w:customStyle="1" w:styleId="TextonotaalfinalCar">
+    <w:name w:val="Texto nota al final Car"/>
+    <w:link w:val="Textonotaalfinal"/>
     <w:uiPriority w:val="99"/>
     <w:semiHidden/>
     <w:unhideWhenUsed/>
     <w:rPr>
       <w:sz w:val="20"/>
       <w:szCs w:val="20"/>
+    </w:rPr>
+  </w:style>
+  <w:style w:type="character" w:styleId="Mencinsinresolver">
+    <w:name w:val="Unresolved Mention"/>
+    <w:basedOn w:val="Fuentedeprrafopredeter"/>
+    <w:uiPriority w:val="99"/>
+    <w:semiHidden/>
+    <w:unhideWhenUsed/>
+    <w:rsid w:val="00852DE8"/>
+    <w:rPr>
+      <w:color w:val="605E5C"/>
+      <w:shd w:val="clear" w:color="auto" w:fill="E1DFDD"/>
     </w:rPr>
   </w:style>
 </w:styles>

</xml_diff>